<commit_message>
final replication before compressing
</commit_message>
<xml_diff>
--- a/Replication_package_2Tails/jeea-checklist.docx
+++ b/Replication_package_2Tails/jeea-checklist.docx
@@ -669,7 +669,16 @@
           <w:color w:val="2A2A2A"/>
           <w:lang w:val="en-US"/>
         </w:rPr>
-        <w:t>3.13.3</w:t>
+        <w:t>3.1</w:t>
+      </w:r>
+      <w:r>
+        <w:rPr>
+          <w:b/>
+          <w:bCs/>
+          <w:color w:val="2A2A2A"/>
+          <w:lang w:val="en-US"/>
+        </w:rPr>
+        <w:t>2</w:t>
       </w:r>
     </w:p>
     <w:p>
@@ -708,7 +717,7 @@
           <w:color w:val="2A2A2A"/>
           <w:lang w:val="en-US"/>
         </w:rPr>
-        <w:t xml:space="preserve"> Empirics approx. 2/3 hours </w:t>
+        <w:t xml:space="preserve"> Empirics approx. </w:t>
       </w:r>
       <w:r>
         <w:rPr>
@@ -717,7 +726,7 @@
           <w:color w:val="2A2A2A"/>
           <w:lang w:val="en-US"/>
         </w:rPr>
-        <w:t>-</w:t>
+        <w:t>1.5</w:t>
       </w:r>
       <w:r>
         <w:rPr>
@@ -726,7 +735,7 @@
           <w:color w:val="2A2A2A"/>
           <w:lang w:val="en-US"/>
         </w:rPr>
-        <w:t xml:space="preserve"> Theory approx. 5</w:t>
+        <w:t xml:space="preserve"> hours </w:t>
       </w:r>
       <w:r>
         <w:rPr>
@@ -735,6 +744,24 @@
           <w:color w:val="2A2A2A"/>
           <w:lang w:val="en-US"/>
         </w:rPr>
+        <w:t>-</w:t>
+      </w:r>
+      <w:r>
+        <w:rPr>
+          <w:b/>
+          <w:bCs/>
+          <w:color w:val="2A2A2A"/>
+          <w:lang w:val="en-US"/>
+        </w:rPr>
+        <w:t xml:space="preserve"> Theory approx. 5</w:t>
+      </w:r>
+      <w:r>
+        <w:rPr>
+          <w:b/>
+          <w:bCs/>
+          <w:color w:val="2A2A2A"/>
+          <w:lang w:val="en-US"/>
+        </w:rPr>
         <w:t xml:space="preserve"> minutes</w:t>
       </w:r>
     </w:p>
@@ -744,23 +771,29 @@
         <w:ind w:left="1080"/>
       </w:pPr>
       <w:r>
-        <w:t xml:space="preserve">X    </w:t>
-      </w:r>
-      <w:r>
-        <w:t xml:space="preserve">The README file also includes: </w:t>
+        <w:t xml:space="preserve">X    The README file also includes: </w:t>
       </w:r>
     </w:p>
     <w:p>
       <w:pPr>
-        <w:numPr>
-          <w:ilvl w:val="1"/>
-          <w:numId w:val="9"/>
-        </w:numPr>
         <w:spacing w:line="240" w:lineRule="auto"/>
-        <w:rPr>
-          <w:color w:val="2A2A2A"/>
-        </w:rPr>
-      </w:pPr>
+        <w:ind w:left="1080"/>
+        <w:rPr>
+          <w:color w:val="2A2A2A"/>
+        </w:rPr>
+      </w:pPr>
+      <w:r>
+        <w:rPr>
+          <w:color w:val="2A2A2A"/>
+        </w:rPr>
+        <w:t>X</w:t>
+      </w:r>
+      <w:r>
+        <w:rPr>
+          <w:color w:val="2A2A2A"/>
+        </w:rPr>
+        <w:tab/>
+      </w:r>
       <w:r>
         <w:rPr>
           <w:color w:val="2A2A2A"/>
@@ -785,15 +818,24 @@
     </w:p>
     <w:p>
       <w:pPr>
-        <w:numPr>
-          <w:ilvl w:val="1"/>
-          <w:numId w:val="9"/>
-        </w:numPr>
         <w:spacing w:line="240" w:lineRule="auto"/>
-        <w:rPr>
-          <w:color w:val="2A2A2A"/>
-        </w:rPr>
-      </w:pPr>
+        <w:ind w:left="1080"/>
+        <w:rPr>
+          <w:color w:val="2A2A2A"/>
+        </w:rPr>
+      </w:pPr>
+      <w:r>
+        <w:rPr>
+          <w:color w:val="2A2A2A"/>
+        </w:rPr>
+        <w:t>X</w:t>
+      </w:r>
+      <w:r>
+        <w:rPr>
+          <w:color w:val="2A2A2A"/>
+        </w:rPr>
+        <w:tab/>
+      </w:r>
       <w:r>
         <w:rPr>
           <w:color w:val="2A2A2A"/>
@@ -4078,12 +4120,6 @@
 </file>
 
 <file path=customXml/item1.xml><?xml version="1.0" encoding="utf-8"?>
-<p:properties xmlns:p="http://schemas.microsoft.com/office/2006/metadata/properties" xmlns:xsi="http://www.w3.org/2001/XMLSchema-instance" xmlns:pc="http://schemas.microsoft.com/office/infopath/2007/PartnerControls">
-  <documentManagement/>
-</p:properties>
-</file>
-
-<file path=customXml/item2.xml><?xml version="1.0" encoding="utf-8"?>
 <?mso-contentType ?>
 <FormTemplates xmlns="http://schemas.microsoft.com/sharepoint/v3/contenttype/forms">
   <Display>DocumentLibraryForm</Display>
@@ -4092,11 +4128,13 @@
 </FormTemplates>
 </file>
 
-<file path=customXml/item3.xml><?xml version="1.0" encoding="utf-8"?>
-<b:Sources xmlns:b="http://schemas.openxmlformats.org/officeDocument/2006/bibliography" xmlns="http://schemas.openxmlformats.org/officeDocument/2006/bibliography" SelectedStyle="\APASixthEditionOfficeOnline.xsl" StyleName="APA" Version="6"/>
+<file path=customXml/item2.xml><?xml version="1.0" encoding="utf-8"?>
+<p:properties xmlns:p="http://schemas.microsoft.com/office/2006/metadata/properties" xmlns:xsi="http://www.w3.org/2001/XMLSchema-instance" xmlns:pc="http://schemas.microsoft.com/office/infopath/2007/PartnerControls">
+  <documentManagement/>
+</p:properties>
 </file>
 
-<file path=customXml/item4.xml><?xml version="1.0" encoding="utf-8"?>
+<file path=customXml/item3.xml><?xml version="1.0" encoding="utf-8"?>
 <ct:contentTypeSchema xmlns:ct="http://schemas.microsoft.com/office/2006/metadata/contentType" xmlns:ma="http://schemas.microsoft.com/office/2006/metadata/properties/metaAttributes" ct:_="" ma:_="" ma:contentTypeName="Unknown Document Type" ma:contentTypeID="0x010104" ma:contentTypeVersion="0" ma:contentTypeDescription="" ma:contentTypeScope="" ma:versionID="05d83ceaa0bbd2e3bc716e6e66bd857a">
   <xsd:schema xmlns:xsd="http://www.w3.org/2001/XMLSchema" xmlns:xs="http://www.w3.org/2001/XMLSchema" xmlns:p="http://schemas.microsoft.com/office/2006/metadata/properties" targetNamespace="http://schemas.microsoft.com/office/2006/metadata/properties" ma:root="true" ma:fieldsID="b3d69fe45253d5ff147bb69036b756a7">
     <xsd:element name="properties">
@@ -4210,7 +4248,19 @@
 </ct:contentTypeSchema>
 </file>
 
+<file path=customXml/item4.xml><?xml version="1.0" encoding="utf-8"?>
+<b:Sources xmlns:b="http://schemas.openxmlformats.org/officeDocument/2006/bibliography" xmlns="http://schemas.openxmlformats.org/officeDocument/2006/bibliography" SelectedStyle="\APASixthEditionOfficeOnline.xsl" StyleName="APA" Version="6"/>
+</file>
+
 <file path=customXml/itemProps1.xml><?xml version="1.0" encoding="utf-8"?>
+<ds:datastoreItem xmlns:ds="http://schemas.openxmlformats.org/officeDocument/2006/customXml" ds:itemID="{2D41D43D-77EB-42E5-81BE-A01CE27C165C}">
+  <ds:schemaRefs>
+    <ds:schemaRef ds:uri="http://schemas.microsoft.com/sharepoint/v3/contenttype/forms"/>
+  </ds:schemaRefs>
+</ds:datastoreItem>
+</file>
+
+<file path=customXml/itemProps2.xml><?xml version="1.0" encoding="utf-8"?>
 <ds:datastoreItem xmlns:ds="http://schemas.openxmlformats.org/officeDocument/2006/customXml" ds:itemID="{FAB5B819-5B05-4AE4-AC2D-39B652A1C3B8}">
   <ds:schemaRefs>
     <ds:schemaRef ds:uri="http://schemas.microsoft.com/office/2006/metadata/properties"/>
@@ -4219,23 +4269,7 @@
 </ds:datastoreItem>
 </file>
 
-<file path=customXml/itemProps2.xml><?xml version="1.0" encoding="utf-8"?>
-<ds:datastoreItem xmlns:ds="http://schemas.openxmlformats.org/officeDocument/2006/customXml" ds:itemID="{2D41D43D-77EB-42E5-81BE-A01CE27C165C}">
-  <ds:schemaRefs>
-    <ds:schemaRef ds:uri="http://schemas.microsoft.com/sharepoint/v3/contenttype/forms"/>
-  </ds:schemaRefs>
-</ds:datastoreItem>
-</file>
-
 <file path=customXml/itemProps3.xml><?xml version="1.0" encoding="utf-8"?>
-<ds:datastoreItem xmlns:ds="http://schemas.openxmlformats.org/officeDocument/2006/customXml" ds:itemID="{693FE5E3-0F2E-43DA-A4B3-58422E9B28A5}">
-  <ds:schemaRefs>
-    <ds:schemaRef ds:uri="http://schemas.openxmlformats.org/officeDocument/2006/bibliography"/>
-  </ds:schemaRefs>
-</ds:datastoreItem>
-</file>
-
-<file path=customXml/itemProps4.xml><?xml version="1.0" encoding="utf-8"?>
 <ds:datastoreItem xmlns:ds="http://schemas.openxmlformats.org/officeDocument/2006/customXml" ds:itemID="{BEA30B7B-4F77-4B80-B210-FADFEE25B7FD}">
   <ds:schemaRefs>
     <ds:schemaRef ds:uri="http://schemas.microsoft.com/office/2006/metadata/contentType"/>
@@ -4249,4 +4283,12 @@
     <ds:schemaRef ds:uri="http://schemas.microsoft.com/office/infopath/2007/PartnerControls"/>
   </ds:schemaRefs>
 </ds:datastoreItem>
+</file>
+
+<file path=customXml/itemProps4.xml><?xml version="1.0" encoding="utf-8"?>
+<ds:datastoreItem xmlns:ds="http://schemas.openxmlformats.org/officeDocument/2006/customXml" ds:itemID="{693FE5E3-0F2E-43DA-A4B3-58422E9B28A5}">
+  <ds:schemaRefs>
+    <ds:schemaRef ds:uri="http://schemas.openxmlformats.org/officeDocument/2006/bibliography"/>
+  </ds:schemaRefs>
+</ds:datastoreItem>
 </file>
</xml_diff>